<commit_message>
modify : applicationproeprties elttrcisitacontroller elettricsitaservice
</commit_message>
<xml_diff>
--- a/AccademiJava/Slide/spring.docx
+++ b/AccademiJava/Slide/spring.docx
@@ -10,7 +10,7 @@
       </w:pPr>
       <w:r>
         <w:rPr>
-          <w:rFonts w:eastAsia="Aptos" w:cs="Aptos" w:ascii="Aptos" w:hAnsi="Aptos"/>
+          <w:rFonts w:eastAsia="Aptos" w:cs="Aptos"/>
           <w:b/>
           <w:bCs/>
           <w:sz w:val="28"/>
@@ -28,7 +28,7 @@
       </w:pPr>
       <w:r>
         <w:rPr>
-          <w:rFonts w:eastAsia="Aptos" w:cs="Aptos" w:ascii="Aptos" w:hAnsi="Aptos"/>
+          <w:rFonts w:eastAsia="Aptos" w:cs="Aptos"/>
           <w:b/>
           <w:bCs/>
           <w:sz w:val="24"/>
@@ -56,7 +56,7 @@
       </w:pPr>
       <w:r>
         <w:rPr>
-          <w:rFonts w:eastAsia="Aptos" w:cs="Aptos" w:ascii="Aptos" w:hAnsi="Aptos"/>
+          <w:rFonts w:eastAsia="Aptos" w:cs="Aptos"/>
           <w:b/>
           <w:bCs/>
           <w:sz w:val="28"/>
@@ -84,7 +84,7 @@
       </w:pPr>
       <w:r>
         <w:rPr>
-          <w:rFonts w:eastAsia="Aptos" w:cs="Aptos" w:ascii="Aptos" w:hAnsi="Aptos"/>
+          <w:rFonts w:eastAsia="Aptos" w:cs="Aptos"/>
           <w:b/>
           <w:bCs/>
           <w:sz w:val="24"/>
@@ -95,7 +95,7 @@
       </w:r>
       <w:r>
         <w:rPr>
-          <w:rFonts w:eastAsia="Aptos" w:cs="Aptos" w:ascii="Aptos" w:hAnsi="Aptos"/>
+          <w:rFonts w:eastAsia="Aptos" w:cs="Aptos"/>
           <w:sz w:val="24"/>
           <w:szCs w:val="24"/>
           <w:lang w:val="it-IT"/>
@@ -121,7 +121,7 @@
       </w:pPr>
       <w:r>
         <w:rPr>
-          <w:rFonts w:eastAsia="Aptos" w:cs="Aptos" w:ascii="Aptos" w:hAnsi="Aptos"/>
+          <w:rFonts w:eastAsia="Aptos" w:cs="Aptos"/>
           <w:sz w:val="24"/>
           <w:szCs w:val="24"/>
           <w:lang w:val="it-IT"/>
@@ -130,7 +130,7 @@
       </w:r>
       <w:r>
         <w:rPr>
-          <w:rFonts w:eastAsia="Aptos" w:cs="Aptos" w:ascii="Aptos" w:hAnsi="Aptos"/>
+          <w:rFonts w:eastAsia="Aptos" w:cs="Aptos"/>
           <w:b/>
           <w:bCs/>
           <w:sz w:val="24"/>
@@ -141,7 +141,7 @@
       </w:r>
       <w:r>
         <w:rPr>
-          <w:rFonts w:eastAsia="Aptos" w:cs="Aptos" w:ascii="Aptos" w:hAnsi="Aptos"/>
+          <w:rFonts w:eastAsia="Aptos" w:cs="Aptos"/>
           <w:sz w:val="24"/>
           <w:szCs w:val="24"/>
           <w:lang w:val="it-IT"/>
@@ -167,7 +167,7 @@
       </w:pPr>
       <w:r>
         <w:rPr>
-          <w:rFonts w:eastAsia="Aptos" w:cs="Aptos" w:ascii="Aptos" w:hAnsi="Aptos"/>
+          <w:rFonts w:eastAsia="Aptos" w:cs="Aptos"/>
           <w:sz w:val="24"/>
           <w:szCs w:val="24"/>
           <w:lang w:val="it-IT"/>
@@ -176,7 +176,7 @@
       </w:r>
       <w:r>
         <w:rPr>
-          <w:rFonts w:eastAsia="Aptos" w:cs="Aptos" w:ascii="Aptos" w:hAnsi="Aptos"/>
+          <w:rFonts w:eastAsia="Aptos" w:cs="Aptos"/>
           <w:b/>
           <w:bCs/>
           <w:sz w:val="24"/>
@@ -187,7 +187,7 @@
       </w:r>
       <w:r>
         <w:rPr>
-          <w:rFonts w:eastAsia="Aptos" w:cs="Aptos" w:ascii="Aptos" w:hAnsi="Aptos"/>
+          <w:rFonts w:eastAsia="Aptos" w:cs="Aptos"/>
           <w:sz w:val="24"/>
           <w:szCs w:val="24"/>
           <w:lang w:val="it-IT"/>
@@ -196,7 +196,7 @@
       </w:r>
       <w:r>
         <w:rPr>
-          <w:rFonts w:eastAsia="Aptos" w:cs="Aptos" w:ascii="Aptos" w:hAnsi="Aptos"/>
+          <w:rFonts w:eastAsia="Aptos" w:cs="Aptos"/>
           <w:b/>
           <w:bCs/>
           <w:sz w:val="24"/>
@@ -207,7 +207,7 @@
       </w:r>
       <w:r>
         <w:rPr>
-          <w:rFonts w:eastAsia="Aptos" w:cs="Aptos" w:ascii="Aptos" w:hAnsi="Aptos"/>
+          <w:rFonts w:eastAsia="Aptos" w:cs="Aptos"/>
           <w:sz w:val="24"/>
           <w:szCs w:val="24"/>
           <w:lang w:val="it-IT"/>
@@ -216,7 +216,7 @@
       </w:r>
       <w:r>
         <w:rPr>
-          <w:rFonts w:eastAsia="Aptos" w:cs="Aptos" w:ascii="Aptos" w:hAnsi="Aptos"/>
+          <w:rFonts w:eastAsia="Aptos" w:cs="Aptos"/>
           <w:b/>
           <w:bCs/>
           <w:sz w:val="24"/>
@@ -227,7 +227,7 @@
       </w:r>
       <w:r>
         <w:rPr>
-          <w:rFonts w:eastAsia="Aptos" w:cs="Aptos" w:ascii="Aptos" w:hAnsi="Aptos"/>
+          <w:rFonts w:eastAsia="Aptos" w:cs="Aptos"/>
           <w:sz w:val="24"/>
           <w:szCs w:val="24"/>
           <w:lang w:val="it-IT"/>
@@ -236,7 +236,7 @@
       </w:r>
       <w:r>
         <w:rPr>
-          <w:rFonts w:eastAsia="Aptos" w:cs="Aptos" w:ascii="Aptos" w:hAnsi="Aptos"/>
+          <w:rFonts w:eastAsia="Aptos" w:cs="Aptos"/>
           <w:b/>
           <w:bCs/>
           <w:sz w:val="24"/>
@@ -247,7 +247,7 @@
       </w:r>
       <w:r>
         <w:rPr>
-          <w:rFonts w:eastAsia="Aptos" w:cs="Aptos" w:ascii="Aptos" w:hAnsi="Aptos"/>
+          <w:rFonts w:eastAsia="Aptos" w:cs="Aptos"/>
           <w:sz w:val="24"/>
           <w:szCs w:val="24"/>
           <w:lang w:val="it-IT"/>
@@ -273,7 +273,7 @@
       </w:pPr>
       <w:r>
         <w:rPr>
-          <w:rFonts w:eastAsia="Aptos" w:cs="Aptos" w:ascii="Aptos" w:hAnsi="Aptos"/>
+          <w:rFonts w:eastAsia="Aptos" w:cs="Aptos"/>
           <w:b/>
           <w:bCs/>
           <w:sz w:val="28"/>
@@ -301,7 +301,7 @@
       </w:pPr>
       <w:r>
         <w:rPr>
-          <w:rFonts w:eastAsia="Aptos" w:cs="Aptos" w:ascii="Aptos" w:hAnsi="Aptos"/>
+          <w:rFonts w:eastAsia="Aptos" w:cs="Aptos"/>
           <w:b/>
           <w:bCs/>
           <w:sz w:val="24"/>
@@ -312,7 +312,7 @@
       </w:r>
       <w:r>
         <w:rPr>
-          <w:rFonts w:eastAsia="Aptos" w:cs="Aptos" w:ascii="Aptos" w:hAnsi="Aptos"/>
+          <w:rFonts w:eastAsia="Aptos" w:cs="Aptos"/>
           <w:sz w:val="24"/>
           <w:szCs w:val="24"/>
           <w:lang w:val="it-IT"/>
@@ -338,7 +338,7 @@
       </w:pPr>
       <w:r>
         <w:rPr>
-          <w:rFonts w:eastAsia="Aptos" w:cs="Aptos" w:ascii="Aptos" w:hAnsi="Aptos"/>
+          <w:rFonts w:eastAsia="Aptos" w:cs="Aptos"/>
           <w:sz w:val="24"/>
           <w:szCs w:val="24"/>
           <w:lang w:val="it-IT"/>
@@ -364,7 +364,7 @@
       </w:pPr>
       <w:r>
         <w:rPr>
-          <w:rFonts w:eastAsia="Aptos" w:cs="Aptos" w:ascii="Aptos" w:hAnsi="Aptos"/>
+          <w:rFonts w:eastAsia="Aptos" w:cs="Aptos"/>
           <w:sz w:val="24"/>
           <w:szCs w:val="24"/>
           <w:lang w:val="it-IT"/>
@@ -373,7 +373,7 @@
       </w:r>
       <w:r>
         <w:rPr>
-          <w:rFonts w:eastAsia="Aptos" w:cs="Aptos" w:ascii="Aptos" w:hAnsi="Aptos"/>
+          <w:rFonts w:eastAsia="Aptos" w:cs="Aptos"/>
           <w:b/>
           <w:bCs/>
           <w:sz w:val="24"/>
@@ -384,7 +384,7 @@
       </w:r>
       <w:r>
         <w:rPr>
-          <w:rFonts w:eastAsia="Aptos" w:cs="Aptos" w:ascii="Aptos" w:hAnsi="Aptos"/>
+          <w:rFonts w:eastAsia="Aptos" w:cs="Aptos"/>
           <w:sz w:val="24"/>
           <w:szCs w:val="24"/>
           <w:lang w:val="it-IT"/>
@@ -410,7 +410,7 @@
       </w:pPr>
       <w:r>
         <w:rPr>
-          <w:rFonts w:eastAsia="Aptos" w:cs="Aptos" w:ascii="Aptos" w:hAnsi="Aptos"/>
+          <w:rFonts w:eastAsia="Aptos" w:cs="Aptos"/>
           <w:b/>
           <w:bCs/>
           <w:sz w:val="28"/>
@@ -438,7 +438,7 @@
       </w:pPr>
       <w:r>
         <w:rPr>
-          <w:rFonts w:eastAsia="Aptos" w:cs="Aptos" w:ascii="Aptos" w:hAnsi="Aptos"/>
+          <w:rFonts w:eastAsia="Aptos" w:cs="Aptos"/>
           <w:sz w:val="24"/>
           <w:szCs w:val="24"/>
           <w:lang w:val="it-IT"/>
@@ -447,7 +447,7 @@
       </w:r>
       <w:r>
         <w:rPr>
-          <w:rFonts w:eastAsia="Aptos" w:cs="Aptos" w:ascii="Aptos" w:hAnsi="Aptos"/>
+          <w:rFonts w:eastAsia="Aptos" w:cs="Aptos"/>
           <w:b/>
           <w:bCs/>
           <w:sz w:val="24"/>
@@ -458,7 +458,7 @@
       </w:r>
       <w:r>
         <w:rPr>
-          <w:rFonts w:eastAsia="Aptos" w:cs="Aptos" w:ascii="Aptos" w:hAnsi="Aptos"/>
+          <w:rFonts w:eastAsia="Aptos" w:cs="Aptos"/>
           <w:sz w:val="24"/>
           <w:szCs w:val="24"/>
           <w:lang w:val="it-IT"/>
@@ -474,7 +474,7 @@
       </w:pPr>
       <w:r>
         <w:rPr>
-          <w:rFonts w:eastAsia="Aptos" w:cs="Aptos" w:ascii="Aptos" w:hAnsi="Aptos"/>
+          <w:rFonts w:eastAsia="Aptos" w:cs="Aptos"/>
           <w:b/>
           <w:bCs/>
           <w:sz w:val="24"/>
@@ -595,7 +595,7 @@
       </w:pPr>
       <w:r>
         <w:rPr>
-          <w:rFonts w:eastAsia="Aptos" w:cs="Aptos" w:ascii="Aptos" w:hAnsi="Aptos"/>
+          <w:rFonts w:eastAsia="Aptos" w:cs="Aptos"/>
           <w:sz w:val="24"/>
           <w:szCs w:val="24"/>
           <w:lang w:val="it-IT"/>
@@ -613,7 +613,7 @@
       </w:r>
       <w:r>
         <w:rPr>
-          <w:rFonts w:eastAsia="Aptos" w:cs="Aptos" w:ascii="Aptos" w:hAnsi="Aptos"/>
+          <w:rFonts w:eastAsia="Aptos" w:cs="Aptos"/>
           <w:sz w:val="24"/>
           <w:szCs w:val="24"/>
           <w:lang w:val="it-IT"/>
@@ -631,7 +631,7 @@
       </w:r>
       <w:r>
         <w:rPr>
-          <w:rFonts w:eastAsia="Aptos" w:cs="Aptos" w:ascii="Aptos" w:hAnsi="Aptos"/>
+          <w:rFonts w:eastAsia="Aptos" w:cs="Aptos"/>
           <w:sz w:val="24"/>
           <w:szCs w:val="24"/>
           <w:lang w:val="it-IT"/>
@@ -657,7 +657,7 @@
       </w:pPr>
       <w:r>
         <w:rPr>
-          <w:rFonts w:eastAsia="Aptos" w:cs="Aptos" w:ascii="Aptos" w:hAnsi="Aptos"/>
+          <w:rFonts w:eastAsia="Aptos" w:cs="Aptos"/>
           <w:b/>
           <w:bCs/>
           <w:sz w:val="28"/>
@@ -685,7 +685,7 @@
       </w:pPr>
       <w:r>
         <w:rPr>
-          <w:rFonts w:eastAsia="Aptos" w:cs="Aptos" w:ascii="Aptos" w:hAnsi="Aptos"/>
+          <w:rFonts w:eastAsia="Aptos" w:cs="Aptos"/>
           <w:b/>
           <w:bCs/>
           <w:sz w:val="24"/>
@@ -696,7 +696,7 @@
       </w:r>
       <w:r>
         <w:rPr>
-          <w:rFonts w:eastAsia="Aptos" w:cs="Aptos" w:ascii="Aptos" w:hAnsi="Aptos"/>
+          <w:rFonts w:eastAsia="Aptos" w:cs="Aptos"/>
           <w:sz w:val="24"/>
           <w:szCs w:val="24"/>
           <w:lang w:val="it-IT"/>
@@ -722,7 +722,7 @@
       </w:pPr>
       <w:r>
         <w:rPr>
-          <w:rFonts w:eastAsia="Aptos" w:cs="Aptos" w:ascii="Aptos" w:hAnsi="Aptos"/>
+          <w:rFonts w:eastAsia="Aptos" w:cs="Aptos"/>
           <w:b/>
           <w:bCs/>
           <w:sz w:val="24"/>
@@ -733,7 +733,7 @@
       </w:r>
       <w:r>
         <w:rPr>
-          <w:rFonts w:eastAsia="Aptos" w:cs="Aptos" w:ascii="Aptos" w:hAnsi="Aptos"/>
+          <w:rFonts w:eastAsia="Aptos" w:cs="Aptos"/>
           <w:sz w:val="24"/>
           <w:szCs w:val="24"/>
           <w:lang w:val="it-IT"/>
@@ -759,7 +759,7 @@
       </w:pPr>
       <w:r>
         <w:rPr>
-          <w:rFonts w:eastAsia="Aptos" w:cs="Aptos" w:ascii="Aptos" w:hAnsi="Aptos"/>
+          <w:rFonts w:eastAsia="Aptos" w:cs="Aptos"/>
           <w:b/>
           <w:bCs/>
           <w:sz w:val="24"/>
@@ -770,7 +770,7 @@
       </w:r>
       <w:r>
         <w:rPr>
-          <w:rFonts w:eastAsia="Aptos" w:cs="Aptos" w:ascii="Aptos" w:hAnsi="Aptos"/>
+          <w:rFonts w:eastAsia="Aptos" w:cs="Aptos"/>
           <w:sz w:val="24"/>
           <w:szCs w:val="24"/>
           <w:lang w:val="it-IT"/>
@@ -796,7 +796,7 @@
       </w:pPr>
       <w:r>
         <w:rPr>
-          <w:rFonts w:eastAsia="Aptos" w:cs="Aptos" w:ascii="Aptos" w:hAnsi="Aptos"/>
+          <w:rFonts w:eastAsia="Aptos" w:cs="Aptos"/>
           <w:b/>
           <w:bCs/>
           <w:sz w:val="24"/>
@@ -807,7 +807,7 @@
       </w:r>
       <w:r>
         <w:rPr>
-          <w:rFonts w:eastAsia="Aptos" w:cs="Aptos" w:ascii="Aptos" w:hAnsi="Aptos"/>
+          <w:rFonts w:eastAsia="Aptos" w:cs="Aptos"/>
           <w:sz w:val="24"/>
           <w:szCs w:val="24"/>
           <w:lang w:val="it-IT"/>
@@ -823,7 +823,7 @@
       </w:pPr>
       <w:r>
         <w:rPr>
-          <w:rFonts w:eastAsia="Aptos" w:cs="Aptos" w:ascii="Aptos" w:hAnsi="Aptos"/>
+          <w:rFonts w:eastAsia="Aptos" w:cs="Aptos"/>
           <w:b/>
           <w:bCs/>
           <w:sz w:val="24"/>
@@ -1057,7 +1057,7 @@
       </w:pPr>
       <w:r>
         <w:rPr>
-          <w:rFonts w:eastAsia="Aptos" w:cs="Aptos" w:ascii="Aptos" w:hAnsi="Aptos"/>
+          <w:rFonts w:eastAsia="Aptos" w:cs="Aptos"/>
           <w:b/>
           <w:bCs/>
           <w:sz w:val="28"/>
@@ -1085,7 +1085,7 @@
       </w:pPr>
       <w:r>
         <w:rPr>
-          <w:rFonts w:eastAsia="Aptos" w:cs="Aptos" w:ascii="Aptos" w:hAnsi="Aptos"/>
+          <w:rFonts w:eastAsia="Aptos" w:cs="Aptos"/>
           <w:b/>
           <w:bCs/>
           <w:sz w:val="24"/>
@@ -1096,7 +1096,7 @@
       </w:r>
       <w:r>
         <w:rPr>
-          <w:rFonts w:eastAsia="Aptos" w:cs="Aptos" w:ascii="Aptos" w:hAnsi="Aptos"/>
+          <w:rFonts w:eastAsia="Aptos" w:cs="Aptos"/>
           <w:sz w:val="24"/>
           <w:szCs w:val="24"/>
           <w:lang w:val="it-IT"/>
@@ -1112,7 +1112,7 @@
       </w:pPr>
       <w:r>
         <w:rPr>
-          <w:rFonts w:eastAsia="Aptos" w:cs="Aptos" w:ascii="Aptos" w:hAnsi="Aptos"/>
+          <w:rFonts w:eastAsia="Aptos" w:cs="Aptos"/>
           <w:b/>
           <w:bCs/>
           <w:sz w:val="24"/>
@@ -1292,7 +1292,7 @@
       </w:pPr>
       <w:r>
         <w:rPr>
-          <w:rFonts w:eastAsia="Aptos" w:cs="Aptos" w:ascii="Aptos" w:hAnsi="Aptos"/>
+          <w:rFonts w:eastAsia="Aptos" w:cs="Aptos"/>
           <w:sz w:val="24"/>
           <w:szCs w:val="24"/>
           <w:lang w:val="it-IT"/>
@@ -1310,7 +1310,7 @@
       </w:r>
       <w:r>
         <w:rPr>
-          <w:rFonts w:eastAsia="Aptos" w:cs="Aptos" w:ascii="Aptos" w:hAnsi="Aptos"/>
+          <w:rFonts w:eastAsia="Aptos" w:cs="Aptos"/>
           <w:sz w:val="24"/>
           <w:szCs w:val="24"/>
           <w:lang w:val="it-IT"/>
@@ -1336,7 +1336,7 @@
       </w:pPr>
       <w:r>
         <w:rPr>
-          <w:rFonts w:eastAsia="Aptos" w:cs="Aptos" w:ascii="Aptos" w:hAnsi="Aptos"/>
+          <w:rFonts w:eastAsia="Aptos" w:cs="Aptos"/>
           <w:b/>
           <w:bCs/>
           <w:sz w:val="28"/>
@@ -1364,7 +1364,7 @@
       </w:pPr>
       <w:r>
         <w:rPr>
-          <w:rFonts w:eastAsia="Aptos" w:cs="Aptos" w:ascii="Aptos" w:hAnsi="Aptos"/>
+          <w:rFonts w:eastAsia="Aptos" w:cs="Aptos"/>
           <w:b/>
           <w:bCs/>
           <w:sz w:val="24"/>
@@ -1375,7 +1375,7 @@
       </w:r>
       <w:r>
         <w:rPr>
-          <w:rFonts w:eastAsia="Aptos" w:cs="Aptos" w:ascii="Aptos" w:hAnsi="Aptos"/>
+          <w:rFonts w:eastAsia="Aptos" w:cs="Aptos"/>
           <w:sz w:val="24"/>
           <w:szCs w:val="24"/>
           <w:lang w:val="it-IT"/>
@@ -1401,7 +1401,7 @@
       </w:pPr>
       <w:r>
         <w:rPr>
-          <w:rFonts w:eastAsia="Aptos" w:cs="Aptos" w:ascii="Aptos" w:hAnsi="Aptos"/>
+          <w:rFonts w:eastAsia="Aptos" w:cs="Aptos"/>
           <w:b/>
           <w:bCs/>
           <w:sz w:val="24"/>
@@ -1412,7 +1412,7 @@
       </w:r>
       <w:r>
         <w:rPr>
-          <w:rFonts w:eastAsia="Aptos" w:cs="Aptos" w:ascii="Aptos" w:hAnsi="Aptos"/>
+          <w:rFonts w:eastAsia="Aptos" w:cs="Aptos"/>
           <w:sz w:val="24"/>
           <w:szCs w:val="24"/>
           <w:lang w:val="it-IT"/>
@@ -1428,7 +1428,7 @@
       </w:pPr>
       <w:r>
         <w:rPr>
-          <w:rFonts w:eastAsia="Aptos" w:cs="Aptos" w:ascii="Aptos" w:hAnsi="Aptos"/>
+          <w:rFonts w:eastAsia="Aptos" w:cs="Aptos"/>
           <w:b/>
           <w:bCs/>
           <w:sz w:val="24"/>
@@ -1608,7 +1608,7 @@
       </w:pPr>
       <w:r>
         <w:rPr>
-          <w:rFonts w:eastAsia="Aptos" w:cs="Aptos" w:ascii="Aptos" w:hAnsi="Aptos"/>
+          <w:rFonts w:eastAsia="Aptos" w:cs="Aptos"/>
           <w:b/>
           <w:bCs/>
           <w:sz w:val="28"/>
@@ -1636,7 +1636,7 @@
       </w:pPr>
       <w:r>
         <w:rPr>
-          <w:rFonts w:eastAsia="Aptos" w:cs="Aptos" w:ascii="Aptos" w:hAnsi="Aptos"/>
+          <w:rFonts w:eastAsia="Aptos" w:cs="Aptos"/>
           <w:b/>
           <w:bCs/>
           <w:sz w:val="24"/>
@@ -1647,7 +1647,7 @@
       </w:r>
       <w:r>
         <w:rPr>
-          <w:rFonts w:eastAsia="Aptos" w:cs="Aptos" w:ascii="Aptos" w:hAnsi="Aptos"/>
+          <w:rFonts w:eastAsia="Aptos" w:cs="Aptos"/>
           <w:sz w:val="24"/>
           <w:szCs w:val="24"/>
           <w:lang w:val="it-IT"/>
@@ -1656,7 +1656,7 @@
       </w:r>
       <w:r>
         <w:rPr>
-          <w:rFonts w:eastAsia="Aptos" w:cs="Aptos" w:ascii="Aptos" w:hAnsi="Aptos"/>
+          <w:rFonts w:eastAsia="Aptos" w:cs="Aptos"/>
           <w:b/>
           <w:bCs/>
           <w:sz w:val="24"/>
@@ -1667,7 +1667,7 @@
       </w:r>
       <w:r>
         <w:rPr>
-          <w:rFonts w:eastAsia="Aptos" w:cs="Aptos" w:ascii="Aptos" w:hAnsi="Aptos"/>
+          <w:rFonts w:eastAsia="Aptos" w:cs="Aptos"/>
           <w:sz w:val="24"/>
           <w:szCs w:val="24"/>
           <w:lang w:val="it-IT"/>
@@ -1683,7 +1683,7 @@
       </w:pPr>
       <w:r>
         <w:rPr>
-          <w:rFonts w:eastAsia="Aptos" w:cs="Aptos" w:ascii="Aptos" w:hAnsi="Aptos"/>
+          <w:rFonts w:eastAsia="Aptos" w:cs="Aptos"/>
           <w:b/>
           <w:bCs/>
           <w:sz w:val="24"/>
@@ -1995,7 +1995,7 @@
       </w:pPr>
       <w:r>
         <w:rPr>
-          <w:rFonts w:eastAsia="Aptos" w:cs="Aptos" w:ascii="Aptos" w:hAnsi="Aptos"/>
+          <w:rFonts w:eastAsia="Aptos" w:cs="Aptos"/>
           <w:sz w:val="24"/>
           <w:szCs w:val="24"/>
           <w:lang w:val="it-IT"/>
@@ -2021,7 +2021,7 @@
       </w:pPr>
       <w:r>
         <w:rPr>
-          <w:rFonts w:eastAsia="Aptos" w:cs="Aptos" w:ascii="Aptos" w:hAnsi="Aptos"/>
+          <w:rFonts w:eastAsia="Aptos" w:cs="Aptos"/>
           <w:b/>
           <w:bCs/>
           <w:sz w:val="28"/>
@@ -2049,7 +2049,7 @@
       </w:pPr>
       <w:r>
         <w:rPr>
-          <w:rFonts w:eastAsia="Aptos" w:cs="Aptos" w:ascii="Aptos" w:hAnsi="Aptos"/>
+          <w:rFonts w:eastAsia="Aptos" w:cs="Aptos"/>
           <w:sz w:val="24"/>
           <w:szCs w:val="24"/>
           <w:lang w:val="it-IT"/>
@@ -2058,7 +2058,7 @@
       </w:r>
       <w:r>
         <w:rPr>
-          <w:rFonts w:eastAsia="Aptos" w:cs="Aptos" w:ascii="Aptos" w:hAnsi="Aptos"/>
+          <w:rFonts w:eastAsia="Aptos" w:cs="Aptos"/>
           <w:b/>
           <w:bCs/>
           <w:sz w:val="24"/>
@@ -2069,7 +2069,7 @@
       </w:r>
       <w:r>
         <w:rPr>
-          <w:rFonts w:eastAsia="Aptos" w:cs="Aptos" w:ascii="Aptos" w:hAnsi="Aptos"/>
+          <w:rFonts w:eastAsia="Aptos" w:cs="Aptos"/>
           <w:sz w:val="24"/>
           <w:szCs w:val="24"/>
           <w:lang w:val="it-IT"/>
@@ -2085,7 +2085,7 @@
       </w:pPr>
       <w:r>
         <w:rPr>
-          <w:rFonts w:eastAsia="Aptos" w:cs="Aptos" w:ascii="Aptos" w:hAnsi="Aptos"/>
+          <w:rFonts w:eastAsia="Aptos" w:cs="Aptos"/>
           <w:b/>
           <w:bCs/>
           <w:sz w:val="24"/>
@@ -2306,7 +2306,7 @@
       </w:pPr>
       <w:r>
         <w:rPr>
-          <w:rFonts w:eastAsia="Aptos" w:cs="Aptos" w:ascii="Aptos" w:hAnsi="Aptos"/>
+          <w:rFonts w:eastAsia="Aptos" w:cs="Aptos"/>
           <w:b/>
           <w:bCs/>
           <w:sz w:val="28"/>
@@ -2334,7 +2334,7 @@
       </w:pPr>
       <w:r>
         <w:rPr>
-          <w:rFonts w:eastAsia="Aptos" w:cs="Aptos" w:ascii="Aptos" w:hAnsi="Aptos"/>
+          <w:rFonts w:eastAsia="Aptos" w:cs="Aptos"/>
           <w:b/>
           <w:bCs/>
           <w:sz w:val="24"/>
@@ -2345,7 +2345,7 @@
       </w:r>
       <w:r>
         <w:rPr>
-          <w:rFonts w:eastAsia="Aptos" w:cs="Aptos" w:ascii="Aptos" w:hAnsi="Aptos"/>
+          <w:rFonts w:eastAsia="Aptos" w:cs="Aptos"/>
           <w:sz w:val="24"/>
           <w:szCs w:val="24"/>
           <w:lang w:val="it-IT"/>
@@ -2354,7 +2354,7 @@
       </w:r>
       <w:r>
         <w:rPr>
-          <w:rFonts w:eastAsia="Aptos" w:cs="Aptos" w:ascii="Aptos" w:hAnsi="Aptos"/>
+          <w:rFonts w:eastAsia="Aptos" w:cs="Aptos"/>
           <w:b/>
           <w:bCs/>
           <w:sz w:val="24"/>
@@ -2365,7 +2365,7 @@
       </w:r>
       <w:r>
         <w:rPr>
-          <w:rFonts w:eastAsia="Aptos" w:cs="Aptos" w:ascii="Aptos" w:hAnsi="Aptos"/>
+          <w:rFonts w:eastAsia="Aptos" w:cs="Aptos"/>
           <w:sz w:val="24"/>
           <w:szCs w:val="24"/>
           <w:lang w:val="it-IT"/>
@@ -2391,7 +2391,7 @@
       </w:pPr>
       <w:r>
         <w:rPr>
-          <w:rFonts w:eastAsia="Aptos" w:cs="Aptos" w:ascii="Aptos" w:hAnsi="Aptos"/>
+          <w:rFonts w:eastAsia="Aptos" w:cs="Aptos"/>
           <w:sz w:val="24"/>
           <w:szCs w:val="24"/>
           <w:lang w:val="it-IT"/>
@@ -2417,7 +2417,7 @@
       </w:pPr>
       <w:r>
         <w:rPr>
-          <w:rFonts w:eastAsia="Aptos" w:cs="Aptos" w:ascii="Aptos" w:hAnsi="Aptos"/>
+          <w:rFonts w:eastAsia="Aptos" w:cs="Aptos"/>
           <w:b/>
           <w:bCs/>
           <w:sz w:val="24"/>
@@ -2428,7 +2428,7 @@
       </w:r>
       <w:r>
         <w:rPr>
-          <w:rFonts w:eastAsia="Aptos" w:cs="Aptos" w:ascii="Aptos" w:hAnsi="Aptos"/>
+          <w:rFonts w:eastAsia="Aptos" w:cs="Aptos"/>
           <w:sz w:val="24"/>
           <w:szCs w:val="24"/>
           <w:lang w:val="it-IT"/>
@@ -2437,7 +2437,7 @@
       </w:r>
       <w:r>
         <w:rPr>
-          <w:rFonts w:eastAsia="Aptos" w:cs="Aptos" w:ascii="Aptos" w:hAnsi="Aptos"/>
+          <w:rFonts w:eastAsia="Aptos" w:cs="Aptos"/>
           <w:b/>
           <w:bCs/>
           <w:sz w:val="24"/>
@@ -2448,7 +2448,7 @@
       </w:r>
       <w:r>
         <w:rPr>
-          <w:rFonts w:eastAsia="Aptos" w:cs="Aptos" w:ascii="Aptos" w:hAnsi="Aptos"/>
+          <w:rFonts w:eastAsia="Aptos" w:cs="Aptos"/>
           <w:sz w:val="24"/>
           <w:szCs w:val="24"/>
           <w:lang w:val="it-IT"/>
@@ -2474,7 +2474,7 @@
       </w:pPr>
       <w:r>
         <w:rPr>
-          <w:rFonts w:eastAsia="Aptos" w:cs="Aptos" w:ascii="Aptos" w:hAnsi="Aptos"/>
+          <w:rFonts w:eastAsia="Aptos" w:cs="Aptos"/>
           <w:sz w:val="24"/>
           <w:szCs w:val="24"/>
           <w:lang w:val="it-IT"/>
@@ -2490,7 +2490,7 @@
       </w:pPr>
       <w:r>
         <w:rPr>
-          <w:rFonts w:eastAsia="Aptos" w:cs="Aptos" w:ascii="Aptos" w:hAnsi="Aptos"/>
+          <w:rFonts w:eastAsia="Aptos" w:cs="Aptos"/>
           <w:b/>
           <w:bCs/>
           <w:sz w:val="19"/>
@@ -2508,7 +2508,7 @@
       </w:pPr>
       <w:r>
         <w:rPr>
-          <w:rFonts w:eastAsia="Aptos" w:cs="Aptos" w:ascii="Aptos" w:hAnsi="Aptos"/>
+          <w:rFonts w:eastAsia="Aptos" w:cs="Aptos"/>
           <w:sz w:val="24"/>
           <w:szCs w:val="24"/>
           <w:lang w:val="it-IT"/>
@@ -2524,7 +2524,7 @@
       </w:pPr>
       <w:r>
         <w:rPr>
-          <w:rFonts w:eastAsia="Aptos" w:cs="Aptos" w:ascii="Aptos" w:hAnsi="Aptos"/>
+          <w:rFonts w:eastAsia="Aptos" w:cs="Aptos"/>
           <w:b/>
           <w:bCs/>
           <w:sz w:val="16"/>
@@ -2542,7 +2542,7 @@
       </w:pPr>
       <w:r>
         <w:rPr>
-          <w:rFonts w:eastAsia="Aptos" w:cs="Aptos" w:ascii="Aptos" w:hAnsi="Aptos"/>
+          <w:rFonts w:eastAsia="Aptos" w:cs="Aptos"/>
           <w:sz w:val="24"/>
           <w:szCs w:val="24"/>
           <w:lang w:val="it-IT"/>
@@ -2551,7 +2551,7 @@
       </w:r>
       <w:r>
         <w:rPr>
-          <w:rFonts w:eastAsia="Aptos" w:cs="Aptos" w:ascii="Aptos" w:hAnsi="Aptos"/>
+          <w:rFonts w:eastAsia="Aptos" w:cs="Aptos"/>
           <w:b/>
           <w:bCs/>
           <w:sz w:val="24"/>
@@ -2562,7 +2562,7 @@
       </w:r>
       <w:r>
         <w:rPr>
-          <w:rFonts w:eastAsia="Aptos" w:cs="Aptos" w:ascii="Aptos" w:hAnsi="Aptos"/>
+          <w:rFonts w:eastAsia="Aptos" w:cs="Aptos"/>
           <w:sz w:val="24"/>
           <w:szCs w:val="24"/>
           <w:lang w:val="it-IT"/>
@@ -2571,7 +2571,7 @@
       </w:r>
       <w:r>
         <w:rPr>
-          <w:rFonts w:eastAsia="Aptos" w:cs="Aptos" w:ascii="Aptos" w:hAnsi="Aptos"/>
+          <w:rFonts w:eastAsia="Aptos" w:cs="Aptos"/>
           <w:b/>
           <w:bCs/>
           <w:sz w:val="24"/>
@@ -2582,7 +2582,7 @@
       </w:r>
       <w:r>
         <w:rPr>
-          <w:rFonts w:eastAsia="Aptos" w:cs="Aptos" w:ascii="Aptos" w:hAnsi="Aptos"/>
+          <w:rFonts w:eastAsia="Aptos" w:cs="Aptos"/>
           <w:sz w:val="24"/>
           <w:szCs w:val="24"/>
           <w:lang w:val="it-IT"/>
@@ -2608,7 +2608,7 @@
       </w:pPr>
       <w:r>
         <w:rPr>
-          <w:rFonts w:eastAsia="Aptos" w:cs="Aptos" w:ascii="Aptos" w:hAnsi="Aptos"/>
+          <w:rFonts w:eastAsia="Aptos" w:cs="Aptos"/>
           <w:b/>
           <w:bCs/>
           <w:sz w:val="28"/>
@@ -2626,7 +2626,7 @@
       </w:pPr>
       <w:r>
         <w:rPr>
-          <w:rFonts w:eastAsia="Aptos" w:cs="Aptos" w:ascii="Aptos" w:hAnsi="Aptos"/>
+          <w:rFonts w:eastAsia="Aptos" w:cs="Aptos"/>
           <w:b/>
           <w:bCs/>
           <w:sz w:val="24"/>
@@ -2654,7 +2654,7 @@
       </w:pPr>
       <w:r>
         <w:rPr>
-          <w:rFonts w:eastAsia="Aptos" w:cs="Aptos" w:ascii="Aptos" w:hAnsi="Aptos"/>
+          <w:rFonts w:eastAsia="Aptos" w:cs="Aptos"/>
           <w:b/>
           <w:bCs/>
           <w:sz w:val="28"/>
@@ -2682,7 +2682,7 @@
       </w:pPr>
       <w:r>
         <w:rPr>
-          <w:rFonts w:eastAsia="Aptos" w:cs="Aptos" w:ascii="Aptos" w:hAnsi="Aptos"/>
+          <w:rFonts w:eastAsia="Aptos" w:cs="Aptos"/>
           <w:b/>
           <w:bCs/>
           <w:sz w:val="24"/>
@@ -2693,7 +2693,7 @@
       </w:r>
       <w:r>
         <w:rPr>
-          <w:rFonts w:eastAsia="Aptos" w:cs="Aptos" w:ascii="Aptos" w:hAnsi="Aptos"/>
+          <w:rFonts w:eastAsia="Aptos" w:cs="Aptos"/>
           <w:sz w:val="24"/>
           <w:szCs w:val="24"/>
           <w:lang w:val="it-IT"/>
@@ -2719,7 +2719,7 @@
       </w:pPr>
       <w:r>
         <w:rPr>
-          <w:rFonts w:eastAsia="Aptos" w:cs="Aptos" w:ascii="Aptos" w:hAnsi="Aptos"/>
+          <w:rFonts w:eastAsia="Aptos" w:cs="Aptos"/>
           <w:sz w:val="24"/>
           <w:szCs w:val="24"/>
           <w:lang w:val="it-IT"/>
@@ -2728,7 +2728,7 @@
       </w:r>
       <w:r>
         <w:rPr>
-          <w:rFonts w:eastAsia="Aptos" w:cs="Aptos" w:ascii="Aptos" w:hAnsi="Aptos"/>
+          <w:rFonts w:eastAsia="Aptos" w:cs="Aptos"/>
           <w:b/>
           <w:bCs/>
           <w:sz w:val="24"/>
@@ -2739,7 +2739,7 @@
       </w:r>
       <w:r>
         <w:rPr>
-          <w:rFonts w:eastAsia="Aptos" w:cs="Aptos" w:ascii="Aptos" w:hAnsi="Aptos"/>
+          <w:rFonts w:eastAsia="Aptos" w:cs="Aptos"/>
           <w:sz w:val="24"/>
           <w:szCs w:val="24"/>
           <w:lang w:val="it-IT"/>
@@ -2765,7 +2765,7 @@
       </w:pPr>
       <w:r>
         <w:rPr>
-          <w:rFonts w:eastAsia="Aptos" w:cs="Aptos" w:ascii="Aptos" w:hAnsi="Aptos"/>
+          <w:rFonts w:eastAsia="Aptos" w:cs="Aptos"/>
           <w:sz w:val="24"/>
           <w:szCs w:val="24"/>
           <w:lang w:val="it-IT"/>
@@ -2774,7 +2774,7 @@
       </w:r>
       <w:r>
         <w:rPr>
-          <w:rFonts w:eastAsia="Aptos" w:cs="Aptos" w:ascii="Aptos" w:hAnsi="Aptos"/>
+          <w:rFonts w:eastAsia="Aptos" w:cs="Aptos"/>
           <w:b/>
           <w:bCs/>
           <w:sz w:val="24"/>
@@ -2785,7 +2785,7 @@
       </w:r>
       <w:r>
         <w:rPr>
-          <w:rFonts w:eastAsia="Aptos" w:cs="Aptos" w:ascii="Aptos" w:hAnsi="Aptos"/>
+          <w:rFonts w:eastAsia="Aptos" w:cs="Aptos"/>
           <w:sz w:val="24"/>
           <w:szCs w:val="24"/>
           <w:lang w:val="it-IT"/>
@@ -2794,7 +2794,7 @@
       </w:r>
       <w:r>
         <w:rPr>
-          <w:rFonts w:eastAsia="Aptos" w:cs="Aptos" w:ascii="Aptos" w:hAnsi="Aptos"/>
+          <w:rFonts w:eastAsia="Aptos" w:cs="Aptos"/>
           <w:b/>
           <w:bCs/>
           <w:sz w:val="24"/>
@@ -2805,7 +2805,7 @@
       </w:r>
       <w:r>
         <w:rPr>
-          <w:rFonts w:eastAsia="Aptos" w:cs="Aptos" w:ascii="Aptos" w:hAnsi="Aptos"/>
+          <w:rFonts w:eastAsia="Aptos" w:cs="Aptos"/>
           <w:sz w:val="24"/>
           <w:szCs w:val="24"/>
           <w:lang w:val="it-IT"/>
@@ -2814,7 +2814,7 @@
       </w:r>
       <w:r>
         <w:rPr>
-          <w:rFonts w:eastAsia="Aptos" w:cs="Aptos" w:ascii="Aptos" w:hAnsi="Aptos"/>
+          <w:rFonts w:eastAsia="Aptos" w:cs="Aptos"/>
           <w:b/>
           <w:bCs/>
           <w:sz w:val="24"/>
@@ -2825,7 +2825,7 @@
       </w:r>
       <w:r>
         <w:rPr>
-          <w:rFonts w:eastAsia="Aptos" w:cs="Aptos" w:ascii="Aptos" w:hAnsi="Aptos"/>
+          <w:rFonts w:eastAsia="Aptos" w:cs="Aptos"/>
           <w:sz w:val="24"/>
           <w:szCs w:val="24"/>
           <w:lang w:val="it-IT"/>
@@ -2834,7 +2834,7 @@
       </w:r>
       <w:r>
         <w:rPr>
-          <w:rFonts w:eastAsia="Aptos" w:cs="Aptos" w:ascii="Aptos" w:hAnsi="Aptos"/>
+          <w:rFonts w:eastAsia="Aptos" w:cs="Aptos"/>
           <w:b/>
           <w:bCs/>
           <w:sz w:val="24"/>
@@ -2845,7 +2845,7 @@
       </w:r>
       <w:r>
         <w:rPr>
-          <w:rFonts w:eastAsia="Aptos" w:cs="Aptos" w:ascii="Aptos" w:hAnsi="Aptos"/>
+          <w:rFonts w:eastAsia="Aptos" w:cs="Aptos"/>
           <w:sz w:val="24"/>
           <w:szCs w:val="24"/>
           <w:lang w:val="it-IT"/>
@@ -2871,7 +2871,7 @@
       </w:pPr>
       <w:r>
         <w:rPr>
-          <w:rFonts w:eastAsia="Aptos" w:cs="Aptos" w:ascii="Aptos" w:hAnsi="Aptos"/>
+          <w:rFonts w:eastAsia="Aptos" w:cs="Aptos"/>
           <w:b/>
           <w:bCs/>
           <w:sz w:val="28"/>
@@ -2899,7 +2899,7 @@
       </w:pPr>
       <w:r>
         <w:rPr>
-          <w:rFonts w:eastAsia="Aptos" w:cs="Aptos" w:ascii="Aptos" w:hAnsi="Aptos"/>
+          <w:rFonts w:eastAsia="Aptos" w:cs="Aptos"/>
           <w:b/>
           <w:bCs/>
           <w:sz w:val="24"/>
@@ -2910,7 +2910,7 @@
       </w:r>
       <w:r>
         <w:rPr>
-          <w:rFonts w:eastAsia="Aptos" w:cs="Aptos" w:ascii="Aptos" w:hAnsi="Aptos"/>
+          <w:rFonts w:eastAsia="Aptos" w:cs="Aptos"/>
           <w:sz w:val="24"/>
           <w:szCs w:val="24"/>
           <w:lang w:val="it-IT"/>
@@ -2936,7 +2936,7 @@
       </w:pPr>
       <w:r>
         <w:rPr>
-          <w:rFonts w:eastAsia="Aptos" w:cs="Aptos" w:ascii="Aptos" w:hAnsi="Aptos"/>
+          <w:rFonts w:eastAsia="Aptos" w:cs="Aptos"/>
           <w:sz w:val="24"/>
           <w:szCs w:val="24"/>
           <w:lang w:val="it-IT"/>
@@ -2962,7 +2962,7 @@
       </w:pPr>
       <w:r>
         <w:rPr>
-          <w:rFonts w:eastAsia="Aptos" w:cs="Aptos" w:ascii="Aptos" w:hAnsi="Aptos"/>
+          <w:rFonts w:eastAsia="Aptos" w:cs="Aptos"/>
           <w:sz w:val="24"/>
           <w:szCs w:val="24"/>
           <w:lang w:val="it-IT"/>
@@ -2971,7 +2971,7 @@
       </w:r>
       <w:r>
         <w:rPr>
-          <w:rFonts w:eastAsia="Aptos" w:cs="Aptos" w:ascii="Aptos" w:hAnsi="Aptos"/>
+          <w:rFonts w:eastAsia="Aptos" w:cs="Aptos"/>
           <w:b/>
           <w:bCs/>
           <w:sz w:val="24"/>
@@ -2982,7 +2982,7 @@
       </w:r>
       <w:r>
         <w:rPr>
-          <w:rFonts w:eastAsia="Aptos" w:cs="Aptos" w:ascii="Aptos" w:hAnsi="Aptos"/>
+          <w:rFonts w:eastAsia="Aptos" w:cs="Aptos"/>
           <w:sz w:val="24"/>
           <w:szCs w:val="24"/>
           <w:lang w:val="it-IT"/>
@@ -3008,7 +3008,7 @@
       </w:pPr>
       <w:r>
         <w:rPr>
-          <w:rFonts w:eastAsia="Aptos" w:cs="Aptos" w:ascii="Aptos" w:hAnsi="Aptos"/>
+          <w:rFonts w:eastAsia="Aptos" w:cs="Aptos"/>
           <w:b/>
           <w:bCs/>
           <w:sz w:val="28"/>
@@ -3036,7 +3036,7 @@
       </w:pPr>
       <w:r>
         <w:rPr>
-          <w:rFonts w:eastAsia="Aptos" w:cs="Aptos" w:ascii="Aptos" w:hAnsi="Aptos"/>
+          <w:rFonts w:eastAsia="Aptos" w:cs="Aptos"/>
           <w:b/>
           <w:bCs/>
           <w:sz w:val="24"/>
@@ -3047,7 +3047,7 @@
       </w:r>
       <w:r>
         <w:rPr>
-          <w:rFonts w:eastAsia="Aptos" w:cs="Aptos" w:ascii="Aptos" w:hAnsi="Aptos"/>
+          <w:rFonts w:eastAsia="Aptos" w:cs="Aptos"/>
           <w:sz w:val="24"/>
           <w:szCs w:val="24"/>
           <w:lang w:val="it-IT"/>
@@ -3063,7 +3063,7 @@
       </w:pPr>
       <w:r>
         <w:rPr>
-          <w:rFonts w:eastAsia="Aptos" w:cs="Aptos" w:ascii="Aptos" w:hAnsi="Aptos"/>
+          <w:rFonts w:eastAsia="Aptos" w:cs="Aptos"/>
           <w:b/>
           <w:bCs/>
           <w:sz w:val="24"/>
@@ -3204,7 +3204,7 @@
       </w:pPr>
       <w:r>
         <w:rPr>
-          <w:rFonts w:eastAsia="Aptos" w:cs="Aptos" w:ascii="Aptos" w:hAnsi="Aptos"/>
+          <w:rFonts w:eastAsia="Aptos" w:cs="Aptos"/>
           <w:sz w:val="24"/>
           <w:szCs w:val="24"/>
           <w:lang w:val="it-IT"/>
@@ -3222,7 +3222,7 @@
       </w:r>
       <w:r>
         <w:rPr>
-          <w:rFonts w:eastAsia="Aptos" w:cs="Aptos" w:ascii="Aptos" w:hAnsi="Aptos"/>
+          <w:rFonts w:eastAsia="Aptos" w:cs="Aptos"/>
           <w:sz w:val="24"/>
           <w:szCs w:val="24"/>
           <w:lang w:val="it-IT"/>
@@ -3240,7 +3240,7 @@
       </w:r>
       <w:r>
         <w:rPr>
-          <w:rFonts w:eastAsia="Aptos" w:cs="Aptos" w:ascii="Aptos" w:hAnsi="Aptos"/>
+          <w:rFonts w:eastAsia="Aptos" w:cs="Aptos"/>
           <w:sz w:val="24"/>
           <w:szCs w:val="24"/>
           <w:lang w:val="it-IT"/>
@@ -3266,7 +3266,7 @@
       </w:pPr>
       <w:r>
         <w:rPr>
-          <w:rFonts w:eastAsia="Aptos" w:cs="Aptos" w:ascii="Aptos" w:hAnsi="Aptos"/>
+          <w:rFonts w:eastAsia="Aptos" w:cs="Aptos"/>
           <w:b/>
           <w:bCs/>
           <w:sz w:val="28"/>
@@ -3294,7 +3294,7 @@
       </w:pPr>
       <w:r>
         <w:rPr>
-          <w:rFonts w:eastAsia="Aptos" w:cs="Aptos" w:ascii="Aptos" w:hAnsi="Aptos"/>
+          <w:rFonts w:eastAsia="Aptos" w:cs="Aptos"/>
           <w:b/>
           <w:bCs/>
           <w:sz w:val="24"/>
@@ -3305,7 +3305,7 @@
       </w:r>
       <w:r>
         <w:rPr>
-          <w:rFonts w:eastAsia="Aptos" w:cs="Aptos" w:ascii="Aptos" w:hAnsi="Aptos"/>
+          <w:rFonts w:eastAsia="Aptos" w:cs="Aptos"/>
           <w:sz w:val="24"/>
           <w:szCs w:val="24"/>
           <w:lang w:val="it-IT"/>
@@ -3331,7 +3331,7 @@
       </w:pPr>
       <w:r>
         <w:rPr>
-          <w:rFonts w:eastAsia="Aptos" w:cs="Aptos" w:ascii="Aptos" w:hAnsi="Aptos"/>
+          <w:rFonts w:eastAsia="Aptos" w:cs="Aptos"/>
           <w:b/>
           <w:bCs/>
           <w:sz w:val="24"/>
@@ -3342,7 +3342,7 @@
       </w:r>
       <w:r>
         <w:rPr>
-          <w:rFonts w:eastAsia="Aptos" w:cs="Aptos" w:ascii="Aptos" w:hAnsi="Aptos"/>
+          <w:rFonts w:eastAsia="Aptos" w:cs="Aptos"/>
           <w:sz w:val="24"/>
           <w:szCs w:val="24"/>
           <w:lang w:val="it-IT"/>
@@ -3368,7 +3368,7 @@
       </w:pPr>
       <w:r>
         <w:rPr>
-          <w:rFonts w:eastAsia="Aptos" w:cs="Aptos" w:ascii="Aptos" w:hAnsi="Aptos"/>
+          <w:rFonts w:eastAsia="Aptos" w:cs="Aptos"/>
           <w:b/>
           <w:bCs/>
           <w:sz w:val="24"/>
@@ -3379,7 +3379,7 @@
       </w:r>
       <w:r>
         <w:rPr>
-          <w:rFonts w:eastAsia="Aptos" w:cs="Aptos" w:ascii="Aptos" w:hAnsi="Aptos"/>
+          <w:rFonts w:eastAsia="Aptos" w:cs="Aptos"/>
           <w:sz w:val="24"/>
           <w:szCs w:val="24"/>
           <w:lang w:val="it-IT"/>
@@ -3405,7 +3405,7 @@
       </w:pPr>
       <w:r>
         <w:rPr>
-          <w:rFonts w:eastAsia="Aptos" w:cs="Aptos" w:ascii="Aptos" w:hAnsi="Aptos"/>
+          <w:rFonts w:eastAsia="Aptos" w:cs="Aptos"/>
           <w:b/>
           <w:bCs/>
           <w:sz w:val="24"/>
@@ -3416,7 +3416,7 @@
       </w:r>
       <w:r>
         <w:rPr>
-          <w:rFonts w:eastAsia="Aptos" w:cs="Aptos" w:ascii="Aptos" w:hAnsi="Aptos"/>
+          <w:rFonts w:eastAsia="Aptos" w:cs="Aptos"/>
           <w:sz w:val="24"/>
           <w:szCs w:val="24"/>
           <w:lang w:val="it-IT"/>
@@ -3432,7 +3432,7 @@
       </w:pPr>
       <w:r>
         <w:rPr>
-          <w:rFonts w:eastAsia="Aptos" w:cs="Aptos" w:ascii="Aptos" w:hAnsi="Aptos"/>
+          <w:rFonts w:eastAsia="Aptos" w:cs="Aptos"/>
           <w:b/>
           <w:bCs/>
           <w:sz w:val="24"/>
@@ -3666,7 +3666,7 @@
       </w:pPr>
       <w:r>
         <w:rPr>
-          <w:rFonts w:eastAsia="Aptos" w:cs="Aptos" w:ascii="Aptos" w:hAnsi="Aptos"/>
+          <w:rFonts w:eastAsia="Aptos" w:cs="Aptos"/>
           <w:b/>
           <w:bCs/>
           <w:sz w:val="28"/>
@@ -3694,7 +3694,7 @@
       </w:pPr>
       <w:r>
         <w:rPr>
-          <w:rFonts w:eastAsia="Aptos" w:cs="Aptos" w:ascii="Aptos" w:hAnsi="Aptos"/>
+          <w:rFonts w:eastAsia="Aptos" w:cs="Aptos"/>
           <w:b/>
           <w:bCs/>
           <w:sz w:val="24"/>
@@ -3705,7 +3705,7 @@
       </w:r>
       <w:r>
         <w:rPr>
-          <w:rFonts w:eastAsia="Aptos" w:cs="Aptos" w:ascii="Aptos" w:hAnsi="Aptos"/>
+          <w:rFonts w:eastAsia="Aptos" w:cs="Aptos"/>
           <w:sz w:val="24"/>
           <w:szCs w:val="24"/>
           <w:lang w:val="it-IT"/>
@@ -3721,7 +3721,7 @@
       </w:pPr>
       <w:r>
         <w:rPr>
-          <w:rFonts w:eastAsia="Aptos" w:cs="Aptos" w:ascii="Aptos" w:hAnsi="Aptos"/>
+          <w:rFonts w:eastAsia="Aptos" w:cs="Aptos"/>
           <w:b/>
           <w:bCs/>
           <w:sz w:val="24"/>
@@ -3901,7 +3901,7 @@
       </w:pPr>
       <w:r>
         <w:rPr>
-          <w:rFonts w:eastAsia="Aptos" w:cs="Aptos" w:ascii="Aptos" w:hAnsi="Aptos"/>
+          <w:rFonts w:eastAsia="Aptos" w:cs="Aptos"/>
           <w:sz w:val="24"/>
           <w:szCs w:val="24"/>
           <w:lang w:val="it-IT"/>
@@ -3919,7 +3919,7 @@
       </w:r>
       <w:r>
         <w:rPr>
-          <w:rFonts w:eastAsia="Aptos" w:cs="Aptos" w:ascii="Aptos" w:hAnsi="Aptos"/>
+          <w:rFonts w:eastAsia="Aptos" w:cs="Aptos"/>
           <w:sz w:val="24"/>
           <w:szCs w:val="24"/>
           <w:lang w:val="it-IT"/>
@@ -3945,7 +3945,7 @@
       </w:pPr>
       <w:r>
         <w:rPr>
-          <w:rFonts w:eastAsia="Aptos" w:cs="Aptos" w:ascii="Aptos" w:hAnsi="Aptos"/>
+          <w:rFonts w:eastAsia="Aptos" w:cs="Aptos"/>
           <w:b/>
           <w:bCs/>
           <w:sz w:val="28"/>
@@ -3973,7 +3973,7 @@
       </w:pPr>
       <w:r>
         <w:rPr>
-          <w:rFonts w:eastAsia="Aptos" w:cs="Aptos" w:ascii="Aptos" w:hAnsi="Aptos"/>
+          <w:rFonts w:eastAsia="Aptos" w:cs="Aptos"/>
           <w:b/>
           <w:bCs/>
           <w:sz w:val="24"/>
@@ -3984,7 +3984,7 @@
       </w:r>
       <w:r>
         <w:rPr>
-          <w:rFonts w:eastAsia="Aptos" w:cs="Aptos" w:ascii="Aptos" w:hAnsi="Aptos"/>
+          <w:rFonts w:eastAsia="Aptos" w:cs="Aptos"/>
           <w:sz w:val="24"/>
           <w:szCs w:val="24"/>
           <w:lang w:val="it-IT"/>
@@ -4010,7 +4010,7 @@
       </w:pPr>
       <w:r>
         <w:rPr>
-          <w:rFonts w:eastAsia="Aptos" w:cs="Aptos" w:ascii="Aptos" w:hAnsi="Aptos"/>
+          <w:rFonts w:eastAsia="Aptos" w:cs="Aptos"/>
           <w:b/>
           <w:bCs/>
           <w:sz w:val="24"/>
@@ -4021,7 +4021,7 @@
       </w:r>
       <w:r>
         <w:rPr>
-          <w:rFonts w:eastAsia="Aptos" w:cs="Aptos" w:ascii="Aptos" w:hAnsi="Aptos"/>
+          <w:rFonts w:eastAsia="Aptos" w:cs="Aptos"/>
           <w:sz w:val="24"/>
           <w:szCs w:val="24"/>
           <w:lang w:val="it-IT"/>
@@ -4037,7 +4037,7 @@
       </w:pPr>
       <w:r>
         <w:rPr>
-          <w:rFonts w:eastAsia="Aptos" w:cs="Aptos" w:ascii="Aptos" w:hAnsi="Aptos"/>
+          <w:rFonts w:eastAsia="Aptos" w:cs="Aptos"/>
           <w:b/>
           <w:bCs/>
           <w:sz w:val="24"/>
@@ -4217,7 +4217,7 @@
       </w:pPr>
       <w:r>
         <w:rPr>
-          <w:rFonts w:eastAsia="Aptos" w:cs="Aptos" w:ascii="Aptos" w:hAnsi="Aptos"/>
+          <w:rFonts w:eastAsia="Aptos" w:cs="Aptos"/>
           <w:b/>
           <w:bCs/>
           <w:sz w:val="28"/>
@@ -4245,7 +4245,7 @@
       </w:pPr>
       <w:r>
         <w:rPr>
-          <w:rFonts w:eastAsia="Aptos" w:cs="Aptos" w:ascii="Aptos" w:hAnsi="Aptos"/>
+          <w:rFonts w:eastAsia="Aptos" w:cs="Aptos"/>
           <w:b/>
           <w:bCs/>
           <w:sz w:val="24"/>
@@ -4256,7 +4256,7 @@
       </w:r>
       <w:r>
         <w:rPr>
-          <w:rFonts w:eastAsia="Aptos" w:cs="Aptos" w:ascii="Aptos" w:hAnsi="Aptos"/>
+          <w:rFonts w:eastAsia="Aptos" w:cs="Aptos"/>
           <w:sz w:val="24"/>
           <w:szCs w:val="24"/>
           <w:lang w:val="it-IT"/>
@@ -4265,7 +4265,7 @@
       </w:r>
       <w:r>
         <w:rPr>
-          <w:rFonts w:eastAsia="Aptos" w:cs="Aptos" w:ascii="Aptos" w:hAnsi="Aptos"/>
+          <w:rFonts w:eastAsia="Aptos" w:cs="Aptos"/>
           <w:b/>
           <w:bCs/>
           <w:sz w:val="24"/>
@@ -4276,7 +4276,7 @@
       </w:r>
       <w:r>
         <w:rPr>
-          <w:rFonts w:eastAsia="Aptos" w:cs="Aptos" w:ascii="Aptos" w:hAnsi="Aptos"/>
+          <w:rFonts w:eastAsia="Aptos" w:cs="Aptos"/>
           <w:sz w:val="24"/>
           <w:szCs w:val="24"/>
           <w:lang w:val="it-IT"/>
@@ -4292,7 +4292,7 @@
       </w:pPr>
       <w:r>
         <w:rPr>
-          <w:rFonts w:eastAsia="Aptos" w:cs="Aptos" w:ascii="Aptos" w:hAnsi="Aptos"/>
+          <w:rFonts w:eastAsia="Aptos" w:cs="Aptos"/>
           <w:b/>
           <w:bCs/>
           <w:sz w:val="24"/>
@@ -4604,7 +4604,7 @@
       </w:pPr>
       <w:r>
         <w:rPr>
-          <w:rFonts w:eastAsia="Aptos" w:cs="Aptos" w:ascii="Aptos" w:hAnsi="Aptos"/>
+          <w:rFonts w:eastAsia="Aptos" w:cs="Aptos"/>
           <w:sz w:val="24"/>
           <w:szCs w:val="24"/>
           <w:lang w:val="it-IT"/>
@@ -4630,7 +4630,7 @@
       </w:pPr>
       <w:r>
         <w:rPr>
-          <w:rFonts w:eastAsia="Aptos" w:cs="Aptos" w:ascii="Aptos" w:hAnsi="Aptos"/>
+          <w:rFonts w:eastAsia="Aptos" w:cs="Aptos"/>
           <w:b/>
           <w:bCs/>
           <w:sz w:val="28"/>
@@ -4658,7 +4658,7 @@
       </w:pPr>
       <w:r>
         <w:rPr>
-          <w:rFonts w:eastAsia="Aptos" w:cs="Aptos" w:ascii="Aptos" w:hAnsi="Aptos"/>
+          <w:rFonts w:eastAsia="Aptos" w:cs="Aptos"/>
           <w:sz w:val="24"/>
           <w:szCs w:val="24"/>
           <w:lang w:val="it-IT"/>
@@ -4667,7 +4667,7 @@
       </w:r>
       <w:r>
         <w:rPr>
-          <w:rFonts w:eastAsia="Aptos" w:cs="Aptos" w:ascii="Aptos" w:hAnsi="Aptos"/>
+          <w:rFonts w:eastAsia="Aptos" w:cs="Aptos"/>
           <w:b/>
           <w:bCs/>
           <w:sz w:val="24"/>
@@ -4678,7 +4678,7 @@
       </w:r>
       <w:r>
         <w:rPr>
-          <w:rFonts w:eastAsia="Aptos" w:cs="Aptos" w:ascii="Aptos" w:hAnsi="Aptos"/>
+          <w:rFonts w:eastAsia="Aptos" w:cs="Aptos"/>
           <w:sz w:val="24"/>
           <w:szCs w:val="24"/>
           <w:lang w:val="it-IT"/>
@@ -4694,7 +4694,7 @@
       </w:pPr>
       <w:r>
         <w:rPr>
-          <w:rFonts w:eastAsia="Aptos" w:cs="Aptos" w:ascii="Aptos" w:hAnsi="Aptos"/>
+          <w:rFonts w:eastAsia="Aptos" w:cs="Aptos"/>
           <w:b/>
           <w:bCs/>
           <w:sz w:val="24"/>
@@ -4915,7 +4915,7 @@
       </w:pPr>
       <w:r>
         <w:rPr>
-          <w:rFonts w:eastAsia="Aptos" w:cs="Aptos" w:ascii="Aptos" w:hAnsi="Aptos"/>
+          <w:rFonts w:eastAsia="Aptos" w:cs="Aptos"/>
           <w:b/>
           <w:bCs/>
           <w:sz w:val="28"/>
@@ -4943,7 +4943,7 @@
       </w:pPr>
       <w:r>
         <w:rPr>
-          <w:rFonts w:eastAsia="Aptos" w:cs="Aptos" w:ascii="Aptos" w:hAnsi="Aptos"/>
+          <w:rFonts w:eastAsia="Aptos" w:cs="Aptos"/>
           <w:b/>
           <w:bCs/>
           <w:sz w:val="24"/>
@@ -4954,7 +4954,7 @@
       </w:r>
       <w:r>
         <w:rPr>
-          <w:rFonts w:eastAsia="Aptos" w:cs="Aptos" w:ascii="Aptos" w:hAnsi="Aptos"/>
+          <w:rFonts w:eastAsia="Aptos" w:cs="Aptos"/>
           <w:sz w:val="24"/>
           <w:szCs w:val="24"/>
           <w:lang w:val="it-IT"/>
@@ -4963,7 +4963,7 @@
       </w:r>
       <w:r>
         <w:rPr>
-          <w:rFonts w:eastAsia="Aptos" w:cs="Aptos" w:ascii="Aptos" w:hAnsi="Aptos"/>
+          <w:rFonts w:eastAsia="Aptos" w:cs="Aptos"/>
           <w:b/>
           <w:bCs/>
           <w:sz w:val="24"/>
@@ -4974,7 +4974,7 @@
       </w:r>
       <w:r>
         <w:rPr>
-          <w:rFonts w:eastAsia="Aptos" w:cs="Aptos" w:ascii="Aptos" w:hAnsi="Aptos"/>
+          <w:rFonts w:eastAsia="Aptos" w:cs="Aptos"/>
           <w:sz w:val="24"/>
           <w:szCs w:val="24"/>
           <w:lang w:val="it-IT"/>
@@ -4983,7 +4983,7 @@
       </w:r>
       <w:r>
         <w:rPr>
-          <w:rFonts w:eastAsia="Aptos" w:cs="Aptos" w:ascii="Aptos" w:hAnsi="Aptos"/>
+          <w:rFonts w:eastAsia="Aptos" w:cs="Aptos"/>
           <w:b/>
           <w:bCs/>
           <w:sz w:val="24"/>
@@ -4994,7 +4994,7 @@
       </w:r>
       <w:r>
         <w:rPr>
-          <w:rFonts w:eastAsia="Aptos" w:cs="Aptos" w:ascii="Aptos" w:hAnsi="Aptos"/>
+          <w:rFonts w:eastAsia="Aptos" w:cs="Aptos"/>
           <w:sz w:val="24"/>
           <w:szCs w:val="24"/>
           <w:lang w:val="it-IT"/>
@@ -5010,7 +5010,7 @@
       </w:pPr>
       <w:r>
         <w:rPr>
-          <w:rFonts w:eastAsia="Aptos" w:cs="Aptos" w:ascii="Aptos" w:hAnsi="Aptos"/>
+          <w:rFonts w:eastAsia="Aptos" w:cs="Aptos"/>
           <w:b/>
           <w:bCs/>
           <w:sz w:val="24"/>
@@ -5191,7 +5191,7 @@
       </w:pPr>
       <w:r>
         <w:rPr>
-          <w:rFonts w:eastAsia="Aptos" w:cs="Aptos" w:ascii="Aptos" w:hAnsi="Aptos"/>
+          <w:rFonts w:eastAsia="Aptos" w:cs="Aptos"/>
           <w:sz w:val="24"/>
           <w:szCs w:val="24"/>
           <w:lang w:val="it-IT"/>
@@ -5217,7 +5217,7 @@
       </w:pPr>
       <w:r>
         <w:rPr>
-          <w:rFonts w:eastAsia="Aptos" w:cs="Aptos" w:ascii="Aptos" w:hAnsi="Aptos"/>
+          <w:rFonts w:eastAsia="Aptos" w:cs="Aptos"/>
           <w:b/>
           <w:bCs/>
           <w:sz w:val="28"/>
@@ -5245,7 +5245,7 @@
       </w:pPr>
       <w:r>
         <w:rPr>
-          <w:rFonts w:eastAsia="Aptos" w:cs="Aptos" w:ascii="Aptos" w:hAnsi="Aptos"/>
+          <w:rFonts w:eastAsia="Aptos" w:cs="Aptos"/>
           <w:b/>
           <w:bCs/>
           <w:sz w:val="24"/>
@@ -5256,7 +5256,7 @@
       </w:r>
       <w:r>
         <w:rPr>
-          <w:rFonts w:eastAsia="Aptos" w:cs="Aptos" w:ascii="Aptos" w:hAnsi="Aptos"/>
+          <w:rFonts w:eastAsia="Aptos" w:cs="Aptos"/>
           <w:sz w:val="24"/>
           <w:szCs w:val="24"/>
           <w:lang w:val="it-IT"/>
@@ -5272,7 +5272,7 @@
       </w:pPr>
       <w:r>
         <w:rPr>
-          <w:rFonts w:eastAsia="Aptos" w:cs="Aptos" w:ascii="Aptos" w:hAnsi="Aptos"/>
+          <w:rFonts w:eastAsia="Aptos" w:cs="Aptos"/>
           <w:b/>
           <w:bCs/>
           <w:sz w:val="24"/>
@@ -5440,7 +5440,7 @@
       </w:pPr>
       <w:r>
         <w:rPr>
-          <w:rFonts w:eastAsia="Aptos" w:cs="Aptos" w:ascii="Aptos" w:hAnsi="Aptos"/>
+          <w:rFonts w:eastAsia="Aptos" w:cs="Aptos"/>
           <w:sz w:val="24"/>
           <w:szCs w:val="24"/>
           <w:lang w:val="it-IT"/>
@@ -5449,7 +5449,7 @@
       </w:r>
       <w:r>
         <w:rPr>
-          <w:rFonts w:eastAsia="Aptos" w:cs="Aptos" w:ascii="Aptos" w:hAnsi="Aptos"/>
+          <w:rFonts w:eastAsia="Aptos" w:cs="Aptos"/>
           <w:b/>
           <w:bCs/>
           <w:sz w:val="24"/>
@@ -5460,7 +5460,7 @@
       </w:r>
       <w:r>
         <w:rPr>
-          <w:rFonts w:eastAsia="Aptos" w:cs="Aptos" w:ascii="Aptos" w:hAnsi="Aptos"/>
+          <w:rFonts w:eastAsia="Aptos" w:cs="Aptos"/>
           <w:sz w:val="24"/>
           <w:szCs w:val="24"/>
           <w:lang w:val="it-IT"/>
@@ -5486,7 +5486,7 @@
       </w:pPr>
       <w:r>
         <w:rPr>
-          <w:rFonts w:eastAsia="Aptos" w:cs="Aptos" w:ascii="Aptos" w:hAnsi="Aptos"/>
+          <w:rFonts w:eastAsia="Aptos" w:cs="Aptos"/>
           <w:b/>
           <w:bCs/>
           <w:sz w:val="28"/>
@@ -5514,7 +5514,7 @@
       </w:pPr>
       <w:r>
         <w:rPr>
-          <w:rFonts w:eastAsia="Aptos" w:cs="Aptos" w:ascii="Aptos" w:hAnsi="Aptos"/>
+          <w:rFonts w:eastAsia="Aptos" w:cs="Aptos"/>
           <w:sz w:val="24"/>
           <w:szCs w:val="24"/>
           <w:lang w:val="it-IT"/>
@@ -5523,7 +5523,7 @@
       </w:r>
       <w:r>
         <w:rPr>
-          <w:rFonts w:eastAsia="Aptos" w:cs="Aptos" w:ascii="Aptos" w:hAnsi="Aptos"/>
+          <w:rFonts w:eastAsia="Aptos" w:cs="Aptos"/>
           <w:b/>
           <w:bCs/>
           <w:sz w:val="24"/>
@@ -5534,7 +5534,7 @@
       </w:r>
       <w:r>
         <w:rPr>
-          <w:rFonts w:eastAsia="Aptos" w:cs="Aptos" w:ascii="Aptos" w:hAnsi="Aptos"/>
+          <w:rFonts w:eastAsia="Aptos" w:cs="Aptos"/>
           <w:sz w:val="24"/>
           <w:szCs w:val="24"/>
           <w:lang w:val="it-IT"/>
@@ -5550,7 +5550,7 @@
       </w:pPr>
       <w:r>
         <w:rPr>
-          <w:rFonts w:eastAsia="Aptos" w:cs="Aptos" w:ascii="Aptos" w:hAnsi="Aptos"/>
+          <w:rFonts w:eastAsia="Aptos" w:cs="Aptos"/>
           <w:b/>
           <w:bCs/>
           <w:sz w:val="24"/>
@@ -5572,7 +5572,7 @@
       </w:r>
       <w:r>
         <w:rPr>
-          <w:rFonts w:eastAsia="Aptos" w:cs="Aptos" w:ascii="Aptos" w:hAnsi="Aptos"/>
+          <w:rFonts w:eastAsia="Aptos" w:cs="Aptos"/>
           <w:sz w:val="24"/>
           <w:szCs w:val="24"/>
           <w:lang w:val="it-IT"/>
@@ -5740,7 +5740,7 @@
       </w:pPr>
       <w:r>
         <w:rPr>
-          <w:rFonts w:eastAsia="Aptos" w:cs="Aptos" w:ascii="Aptos" w:hAnsi="Aptos"/>
+          <w:rFonts w:eastAsia="Aptos" w:cs="Aptos"/>
           <w:b/>
           <w:bCs/>
           <w:sz w:val="24"/>
@@ -5762,7 +5762,7 @@
       </w:r>
       <w:r>
         <w:rPr>
-          <w:rFonts w:eastAsia="Aptos" w:cs="Aptos" w:ascii="Aptos" w:hAnsi="Aptos"/>
+          <w:rFonts w:eastAsia="Aptos" w:cs="Aptos"/>
           <w:sz w:val="24"/>
           <w:szCs w:val="24"/>
           <w:lang w:val="it-IT"/>
@@ -5904,7 +5904,7 @@
       </w:pPr>
       <w:r>
         <w:rPr>
-          <w:rFonts w:eastAsia="Aptos" w:cs="Aptos" w:ascii="Aptos" w:hAnsi="Aptos"/>
+          <w:rFonts w:eastAsia="Aptos" w:cs="Aptos"/>
           <w:b/>
           <w:bCs/>
           <w:sz w:val="24"/>
@@ -5915,7 +5915,7 @@
       </w:r>
       <w:r>
         <w:rPr>
-          <w:rFonts w:eastAsia="Aptos" w:cs="Aptos" w:ascii="Aptos" w:hAnsi="Aptos"/>
+          <w:rFonts w:eastAsia="Aptos" w:cs="Aptos"/>
           <w:sz w:val="24"/>
           <w:szCs w:val="24"/>
           <w:lang w:val="it-IT"/>
@@ -6136,7 +6136,7 @@
       </w:pPr>
       <w:r>
         <w:rPr>
-          <w:rFonts w:eastAsia="Aptos" w:cs="Aptos" w:ascii="Aptos" w:hAnsi="Aptos"/>
+          <w:rFonts w:eastAsia="Aptos" w:cs="Aptos"/>
           <w:b/>
           <w:bCs/>
           <w:sz w:val="24"/>
@@ -6147,7 +6147,7 @@
       </w:r>
       <w:r>
         <w:rPr>
-          <w:rFonts w:eastAsia="Aptos" w:cs="Aptos" w:ascii="Aptos" w:hAnsi="Aptos"/>
+          <w:rFonts w:eastAsia="Aptos" w:cs="Aptos"/>
           <w:sz w:val="24"/>
           <w:szCs w:val="24"/>
           <w:lang w:val="it-IT"/>
@@ -6327,7 +6327,7 @@
       </w:pPr>
       <w:r>
         <w:rPr>
-          <w:rFonts w:eastAsia="Aptos" w:cs="Aptos" w:ascii="Aptos" w:hAnsi="Aptos"/>
+          <w:rFonts w:eastAsia="Aptos" w:cs="Aptos"/>
           <w:b/>
           <w:bCs/>
           <w:sz w:val="28"/>
@@ -6355,7 +6355,7 @@
       </w:pPr>
       <w:r>
         <w:rPr>
-          <w:rFonts w:eastAsia="Aptos" w:cs="Aptos" w:ascii="Aptos" w:hAnsi="Aptos"/>
+          <w:rFonts w:eastAsia="Aptos" w:cs="Aptos"/>
           <w:b/>
           <w:bCs/>
           <w:sz w:val="24"/>
@@ -6366,7 +6366,7 @@
       </w:r>
       <w:r>
         <w:rPr>
-          <w:rFonts w:eastAsia="Aptos" w:cs="Aptos" w:ascii="Aptos" w:hAnsi="Aptos"/>
+          <w:rFonts w:eastAsia="Aptos" w:cs="Aptos"/>
           <w:sz w:val="24"/>
           <w:szCs w:val="24"/>
           <w:lang w:val="it-IT"/>
@@ -6375,7 +6375,7 @@
       </w:r>
       <w:r>
         <w:rPr>
-          <w:rFonts w:eastAsia="Aptos" w:cs="Aptos" w:ascii="Aptos" w:hAnsi="Aptos"/>
+          <w:rFonts w:eastAsia="Aptos" w:cs="Aptos"/>
           <w:b/>
           <w:bCs/>
           <w:sz w:val="24"/>
@@ -6386,7 +6386,7 @@
       </w:r>
       <w:r>
         <w:rPr>
-          <w:rFonts w:eastAsia="Aptos" w:cs="Aptos" w:ascii="Aptos" w:hAnsi="Aptos"/>
+          <w:rFonts w:eastAsia="Aptos" w:cs="Aptos"/>
           <w:sz w:val="24"/>
           <w:szCs w:val="24"/>
           <w:lang w:val="it-IT"/>
@@ -6412,7 +6412,7 @@
       </w:pPr>
       <w:r>
         <w:rPr>
-          <w:rFonts w:eastAsia="Aptos" w:cs="Aptos" w:ascii="Aptos" w:hAnsi="Aptos"/>
+          <w:rFonts w:eastAsia="Aptos" w:cs="Aptos"/>
           <w:sz w:val="24"/>
           <w:szCs w:val="24"/>
           <w:lang w:val="it-IT"/>
@@ -6438,7 +6438,7 @@
       </w:pPr>
       <w:r>
         <w:rPr>
-          <w:rFonts w:eastAsia="Aptos" w:cs="Aptos" w:ascii="Aptos" w:hAnsi="Aptos"/>
+          <w:rFonts w:eastAsia="Aptos" w:cs="Aptos"/>
           <w:sz w:val="24"/>
           <w:szCs w:val="24"/>
           <w:lang w:val="it-IT"/>
@@ -6447,7 +6447,7 @@
       </w:r>
       <w:r>
         <w:rPr>
-          <w:rFonts w:eastAsia="Aptos" w:cs="Aptos" w:ascii="Aptos" w:hAnsi="Aptos"/>
+          <w:rFonts w:eastAsia="Aptos" w:cs="Aptos"/>
           <w:b/>
           <w:bCs/>
           <w:sz w:val="24"/>
@@ -6458,7 +6458,7 @@
       </w:r>
       <w:r>
         <w:rPr>
-          <w:rFonts w:eastAsia="Aptos" w:cs="Aptos" w:ascii="Aptos" w:hAnsi="Aptos"/>
+          <w:rFonts w:eastAsia="Aptos" w:cs="Aptos"/>
           <w:sz w:val="24"/>
           <w:szCs w:val="24"/>
           <w:lang w:val="it-IT"/>
@@ -11074,6 +11074,7 @@
     <w:qFormat/>
     <w:pPr>
       <w:widowControl/>
+      <w:suppressAutoHyphens w:val="true"/>
       <w:bidi w:val="0"/>
       <w:spacing w:lineRule="auto" w:line="278" w:before="0" w:after="160"/>
       <w:jc w:val="start"/>
@@ -11214,6 +11215,32 @@
       <w:rFonts w:cs="Lucida Sans"/>
     </w:rPr>
   </w:style>
+  <w:style w:type="paragraph" w:styleId="Titolouser">
+    <w:name w:val="Titolo (user)"/>
+    <w:basedOn w:val="Normal"/>
+    <w:next w:val="BodyText"/>
+    <w:qFormat/>
+    <w:pPr>
+      <w:keepNext w:val="true"/>
+      <w:spacing w:before="240" w:after="120"/>
+    </w:pPr>
+    <w:rPr>
+      <w:rFonts w:ascii="Liberation Sans" w:hAnsi="Liberation Sans" w:eastAsia="Microsoft YaHei" w:cs="Lucida Sans"/>
+      <w:sz w:val="28"/>
+      <w:szCs w:val="28"/>
+    </w:rPr>
+  </w:style>
+  <w:style w:type="paragraph" w:styleId="Indiceuser">
+    <w:name w:val="Indice (user)"/>
+    <w:basedOn w:val="Normal"/>
+    <w:qFormat/>
+    <w:pPr>
+      <w:suppressLineNumbers/>
+    </w:pPr>
+    <w:rPr>
+      <w:rFonts w:cs="Lucida Sans"/>
+    </w:rPr>
+  </w:style>
   <w:style w:type="paragraph" w:styleId="ListParagraph">
     <w:name w:val="List Paragraph"/>
     <w:basedOn w:val="Normal"/>
@@ -11227,8 +11254,8 @@
     </w:pPr>
     <w:rPr/>
   </w:style>
-  <w:style w:type="numbering" w:styleId="Nessunelenco" w:default="1">
-    <w:name w:val="Nessun elenco"/>
+  <w:style w:type="numbering" w:styleId="Nessunelencouser" w:default="1">
+    <w:name w:val="Nessun elenco (user)"/>
     <w:uiPriority w:val="99"/>
     <w:semiHidden/>
     <w:unhideWhenUsed/>

</xml_diff>